<commit_message>
Add Wolflayer project and update skill rules
Introduce P8 "Wolflayer" personal project (live at wolflayer.app) with bullets describing tech stack, features, and usage guidance. Update project mapping and resume tailoring logic to include P8. Clarify RULE 1 and RULE 8 to permit claiming Next.js/React/TypeScript/Supabase only when emphasizing the Wolflayer personal project (not as professional/Flexera experience) and adjust the list of explicitly unused technologies accordingly. Also include updated .docx templates.
</commit_message>
<xml_diff>
--- a/template_de.docx
+++ b/template_de.docx
@@ -1796,6 +1796,173 @@
           <w:rtl w:val="0"/>
         </w:rPr>
         <w:t xml:space="preserve">PROJEKTE</w:t>
+      </w:r>
+      <w:r>
+        <w:rPr>
+          <w:rtl w:val="0"/>
+        </w:rPr>
+      </w:r>
+    </w:p>
+    <w:p>
+      <w:pPr>
+        <w:spacing w:after="60" w:before="100" w:lineRule="auto"/>
+        <w:rPr/>
+      </w:pPr>
+      <w:r>
+        <w:rPr>
+          <w:rFonts w:ascii="Arial" w:cs="Arial" w:eastAsia="Arial" w:hAnsi="Arial"/>
+          <w:b w:val="1"/>
+          <w:bCs w:val="1"/>
+          <w:color w:val="1f3864"/>
+          <w:sz w:val="21"/>
+          <w:szCs w:val="21"/>
+          <w:rtl w:val="0"/>
+        </w:rPr>
+        <w:t xml:space="preserve">Wolflayer – KI-Kollaborationsplattform (wolflayer.app)</w:t>
+      </w:r>
+      <w:r>
+        <w:rPr>
+          <w:rtl w:val="0"/>
+        </w:rPr>
+      </w:r>
+    </w:p>
+    <w:p>
+      <w:pPr>
+        <w:keepNext w:val="0"/>
+        <w:keepLines w:val="0"/>
+        <w:pageBreakBefore w:val="0"/>
+        <w:widowControl w:val="1"/>
+        <w:numPr>
+          <w:ilvl w:val="0"/>
+          <w:numId w:val="1"/>
+        </w:numPr>
+        <w:pBdr>
+          <w:top w:space="0" w:sz="0" w:val="nil"/>
+          <w:left w:space="0" w:sz="0" w:val="nil"/>
+          <w:bottom w:space="0" w:sz="0" w:val="nil"/>
+          <w:right w:space="0" w:sz="0" w:val="nil"/>
+          <w:between w:space="0" w:sz="0" w:val="nil"/>
+        </w:pBdr>
+        <w:shd w:fill="auto" w:val="clear"/>
+        <w:spacing w:after="30" w:before="30" w:line="240" w:lineRule="auto"/>
+        <w:ind w:left="480" w:right="0" w:hanging="240"/>
+        <w:jc w:val="left"/>
+        <w:rPr/>
+      </w:pPr>
+      <w:r>
+        <w:rPr>
+          <w:rFonts w:ascii="Arial" w:cs="Arial" w:eastAsia="Arial" w:hAnsi="Arial"/>
+          <w:b w:val="0"/>
+          <w:bCs w:val="0"/>
+          <w:i w:val="0"/>
+          <w:iCs w:val="0"/>
+          <w:smallCaps w:val="0"/>
+          <w:strike w:val="0"/>
+          <w:color w:val="555555"/>
+          <w:sz w:val="20"/>
+          <w:szCs w:val="20"/>
+          <w:u w:val="none"/>
+          <w:shd w:fill="auto" w:val="clear"/>
+          <w:vertAlign w:val="baseline"/>
+          <w:rtl w:val="0"/>
+        </w:rPr>
+        <w:t xml:space="preserve">Eigenständig entwickelt und deployed – eine produktive Full-Stack-Echtzeitplattform (Next.js, React, TypeScript, Supabase) mit rollenbasierter Zugriffskontrolle und OAuth-Integrationen (GitHub, Google).</w:t>
+      </w:r>
+      <w:r>
+        <w:rPr>
+          <w:rtl w:val="0"/>
+        </w:rPr>
+      </w:r>
+    </w:p>
+    <w:p>
+      <w:pPr>
+        <w:keepNext w:val="0"/>
+        <w:keepLines w:val="0"/>
+        <w:pageBreakBefore w:val="0"/>
+        <w:widowControl w:val="1"/>
+        <w:numPr>
+          <w:ilvl w:val="0"/>
+          <w:numId w:val="1"/>
+        </w:numPr>
+        <w:pBdr>
+          <w:top w:space="0" w:sz="0" w:val="nil"/>
+          <w:left w:space="0" w:sz="0" w:val="nil"/>
+          <w:bottom w:space="0" w:sz="0" w:val="nil"/>
+          <w:right w:space="0" w:sz="0" w:val="nil"/>
+          <w:between w:space="0" w:sz="0" w:val="nil"/>
+        </w:pBdr>
+        <w:shd w:fill="auto" w:val="clear"/>
+        <w:spacing w:after="30" w:before="30" w:line="240" w:lineRule="auto"/>
+        <w:ind w:left="480" w:right="0" w:hanging="240"/>
+        <w:jc w:val="left"/>
+        <w:rPr/>
+      </w:pPr>
+      <w:r>
+        <w:rPr>
+          <w:rFonts w:ascii="Arial" w:cs="Arial" w:eastAsia="Arial" w:hAnsi="Arial"/>
+          <w:b w:val="0"/>
+          <w:bCs w:val="0"/>
+          <w:i w:val="0"/>
+          <w:iCs w:val="0"/>
+          <w:smallCaps w:val="0"/>
+          <w:strike w:val="0"/>
+          <w:color w:val="555555"/>
+          <w:sz w:val="20"/>
+          <w:szCs w:val="20"/>
+          <w:u w:val="none"/>
+          <w:shd w:fill="auto" w:val="clear"/>
+          <w:vertAlign w:val="baseline"/>
+          <w:rtl w:val="0"/>
+        </w:rPr>
+        <w:t xml:space="preserve">Umsetzung eines KI-Workspace auf Basis von Google Gemini sowie einer visuellen Workflow-Ausführungs-Engine, inkl. AES-256-GCM-Verschlüsselung gespeicherter Zugangsdaten.</w:t>
+      </w:r>
+      <w:r>
+        <w:rPr>
+          <w:rtl w:val="0"/>
+        </w:rPr>
+      </w:r>
+    </w:p>
+    <w:p>
+      <w:pPr>
+        <w:keepNext w:val="0"/>
+        <w:keepLines w:val="0"/>
+        <w:pageBreakBefore w:val="0"/>
+        <w:widowControl w:val="1"/>
+        <w:numPr>
+          <w:ilvl w:val="0"/>
+          <w:numId w:val="1"/>
+        </w:numPr>
+        <w:pBdr>
+          <w:top w:space="0" w:sz="0" w:val="nil"/>
+          <w:left w:space="0" w:sz="0" w:val="nil"/>
+          <w:bottom w:space="0" w:sz="0" w:val="nil"/>
+          <w:right w:space="0" w:sz="0" w:val="nil"/>
+          <w:between w:space="0" w:sz="0" w:val="nil"/>
+        </w:pBdr>
+        <w:shd w:fill="auto" w:val="clear"/>
+        <w:spacing w:after="30" w:before="30" w:line="240" w:lineRule="auto"/>
+        <w:ind w:left="480" w:right="0" w:hanging="240"/>
+        <w:jc w:val="left"/>
+        <w:rPr/>
+      </w:pPr>
+      <w:r>
+        <w:rPr>
+          <w:rFonts w:ascii="Arial" w:cs="Arial" w:eastAsia="Arial" w:hAnsi="Arial"/>
+          <w:b w:val="0"/>
+          <w:bCs w:val="0"/>
+          <w:i w:val="0"/>
+          <w:iCs w:val="0"/>
+          <w:smallCaps w:val="0"/>
+          <w:strike w:val="0"/>
+          <w:color w:val="555555"/>
+          <w:sz w:val="20"/>
+          <w:szCs w:val="20"/>
+          <w:u w:val="none"/>
+          <w:shd w:fill="auto" w:val="clear"/>
+          <w:vertAlign w:val="baseline"/>
+          <w:rtl w:val="0"/>
+        </w:rPr>
+        <w:t xml:space="preserve">Ende-zu-Ende-Verantwortung: Problemdefinition, Scope, Architektur und Roadmap.</w:t>
       </w:r>
       <w:r>
         <w:rPr>

</xml_diff>